<commit_message>
docs: refresh accumulated family reference for DP 0.8
</commit_message>
<xml_diff>
--- a/IsoGraph_Family_Reference_Joshua_Oshiro_2026.docx
+++ b/IsoGraph_Family_Reference_Joshua_Oshiro_2026.docx
@@ -37,34 +37,23 @@
         <w:jc w:val="center"/>
       </w:pPr>
       <w:r>
-        <w:rPr>
-          <w:b/>
-        </w:rPr>
-        <w:t>Current repository snapshot: main@ef5414b1733b3619356039722a7280cc94ac49d4</w:t>
+        <w:t>Current qualified-authority snapshot: main@ef5414b1733b3619356039722a7280cc94ac49d4</w:t>
         <w:br/>
         <w:t>26 September 2026</w:t>
         <w:br/>
-      </w:r>
-      <w:r>
         <w:t>Author: Joshua Oshiro</w:t>
         <w:br/>
         <w:t>Copyright © 2026 Joshua Oshiro</w:t>
         <w:br/>
         <w:t>Repository: iteathen/IsoGraph</w:t>
         <w:br/>
-        <w:t>License: GNU Affero General Public License, version 3 (AGPL-3.0)</w:t>
+        <w:t>License: GNU Affero General Public License, v3.0</w:t>
       </w:r>
     </w:p>
     <w:p>
-      <w:pPr>
-        <w:jc w:val="center"/>
-      </w:pPr>
+      <w:pPr/>
       <w:r>
-        <w:rPr>
-          <w:b/>
-          <w:color w:val="17365D"/>
-        </w:rPr>
-        <w:t>FINAL-PRODUCT STATUS</w:t>
+        <w:t>SUCCESSOR DRAFT SURFACE: DP 0.8 — Minimum Sufficient Support and Valuation is included in this branch-maintained edition as an unqualified successor candidate under PR #48. Current qualified Discovery Protocol authority remains DP 0.1–0.7.</w:t>
       </w:r>
     </w:p>
     <w:p>
@@ -72,7 +61,7 @@
         <w:jc w:val="center"/>
       </w:pPr>
       <w:r>
-        <w:t>This is the maintained accumulated reference product for the IsoGraph family. It is kept current with qualified authority changes. It is not itself semantic authority: exact repository specifications, qualification records, and the current qualified-module manifest remain controlling.</w:t>
+        <w:t>This is the maintained accumulated reference product for the IsoGraph family. It is kept current with maintained family changes, including explicitly unqualified successor material present on the branch being reviewed. It is not itself semantic authority: exact repository specifications, qualification records, and the qualified-module manifest remain controlling. Candidate material is labeled as such and does not become current authority merely by appearing here.</w:t>
       </w:r>
     </w:p>
     <w:p>
@@ -174,6 +163,14 @@
     </w:p>
     <w:p>
       <w:pPr>
+        <w:pStyle w:val="BodyText"/>
+      </w:pPr>
+      <w:r>
+        <w:t>Successor work under review: DP 0.8 — Minimum Sufficient Support and Valuation candidate; qualification plan and non-authoritative Logic Lens companion present; not current authority.</w:t>
+      </w:r>
+    </w:p>
+    <w:p>
+      <w:pPr>
         <w:pStyle w:val="Heading1"/>
       </w:pPr>
       <w:r>
@@ -248,6 +245,14 @@
       </w:pPr>
       <w:r>
         <w:t>7. Discovery Protocols 0.1–0.7</w:t>
+      </w:r>
+    </w:p>
+    <w:p>
+      <w:pPr>
+        <w:pStyle w:val="BodyText"/>
+      </w:pPr>
+      <w:r>
+        <w:t>7.5 DP 0.8 minimum sufficient support and valuation successor candidate (unqualified)</w:t>
       </w:r>
     </w:p>
     <w:p>
@@ -765,6 +770,41 @@
         </w:tc>
       </w:tr>
       <w:tr>
+        <w:tc>
+          <w:tcPr>
+            <w:tcW w:type="dxa" w:w="3389"/>
+          </w:tcPr>
+          <w:p>
+            <w:pPr/>
+            <w:r>
+              <w:t>Discovery Protocol successor</w:t>
+            </w:r>
+          </w:p>
+        </w:tc>
+        <w:tc>
+          <w:tcPr>
+            <w:tcW w:type="dxa" w:w="3389"/>
+          </w:tcPr>
+          <w:p>
+            <w:pPr/>
+            <w:r>
+              <w:t>Objective-scoped sufficiency analysis, alternative sufficient topology, implicit logical-dependence search, and application-supplied valuation</w:t>
+            </w:r>
+          </w:p>
+        </w:tc>
+        <w:tc>
+          <w:tcPr>
+            <w:tcW w:type="dxa" w:w="3389"/>
+          </w:tcPr>
+          <w:p>
+            <w:pPr/>
+            <w:r>
+              <w:t>DP 0.8 unqualified successor candidate; current qualified DP authority remains 0.1–0.7</w:t>
+            </w:r>
+          </w:p>
+        </w:tc>
+      </w:tr>
+      <w:tr>
         <w:trPr>
           <w:cantSplit/>
         </w:trPr>
@@ -3206,6 +3246,110 @@
     <w:p/>
     <w:p>
       <w:pPr>
+        <w:pStyle w:val="Heading2"/>
+      </w:pPr>
+      <w:r>
+        <w:t>7.5 DP 0.8 — minimum sufficient support and valuation successor candidate</w:t>
+      </w:r>
+    </w:p>
+    <w:p>
+      <w:pPr>
+        <w:pStyle w:val="BodyText"/>
+      </w:pPr>
+      <w:r>
+        <w:t>Status: unqualified successor candidate. Source: extensions/discovery/DISCOVERY_PROTOCOLS_0_8_CANDIDATE.md (Git blob 46b94fe4cbd407d6d690980604fe5eb854220f67). Qualification plan: qualification/DISCOVERY_PROTOCOLS_0_8_QUALIFICATION_PLAN.md. The qualified cumulative Discovery Protocol module remains DP 0.1–0.7.</w:t>
+      </w:r>
+    </w:p>
+    <w:p>
+      <w:pPr>
+        <w:pStyle w:val="ListBullet"/>
+      </w:pPr>
+      <w:r>
+        <w:t>Core representation minimality and DP support minimality are separate: Core preserves a minimal primitive representation of the represented meaning; DP may ask which represented support is necessary for a declared objective.</w:t>
+      </w:r>
+    </w:p>
+    <w:p>
+      <w:pPr>
+        <w:pStyle w:val="ListBullet"/>
+      </w:pPr>
+      <w:r>
+        <w:t>Before treating assertions as independent, DP 0.8 prioritizes valid implicit-assertion discovery over implication, exclusion, exhaustiveness, partitions, residual classes, necessary/sufficient conditions, constraint implication, and other authority-supported dependence.</w:t>
+      </w:r>
+    </w:p>
+    <w:p>
+      <w:pPr>
+        <w:pStyle w:val="ListBullet"/>
+      </w:pPr>
+      <w:r>
+        <w:t>For a declared target, DP distinguishes the upstream support cone from a bounded objective-relevant analysis slice that may include only the consumer, fallback, bypass, witness, provenance, or side-effect topology needed to judge necessity.</w:t>
+      </w:r>
+    </w:p>
+    <w:p>
+      <w:pPr>
+        <w:pStyle w:val="ListBullet"/>
+      </w:pPr>
+      <w:r>
+        <w:t>A support is sufficient only when it preserves the declared inputs, authority envelope, scope, precision/modality, load-bearing unknowns, required externally visible behavior, and any required witness/certificate/provenance obligations.</w:t>
+      </w:r>
+    </w:p>
+    <w:p>
+      <w:pPr>
+        <w:pStyle w:val="ListBullet"/>
+      </w:pPr>
+      <w:r>
+        <w:t>Minimal sufficient support means irreducible under a declared reduction relation. Minimum support is stronger and is only meaningful relative to a declared candidate space and ordering/measure; several minimal supports may exist with no minimum.</w:t>
+      </w:r>
+    </w:p>
+    <w:p>
+      <w:pPr>
+        <w:pStyle w:val="ListBullet"/>
+      </w:pPr>
+      <w:r>
+        <w:t>NONESSENTIAL_FOR_SUFFICIENCY means a support contributes no unique necessity to the declared target. It does not itself recommend omission: an optional accelerator may remain preferable under the application valuation.</w:t>
+      </w:r>
+    </w:p>
+    <w:p>
+      <w:pPr>
+        <w:pStyle w:val="ListBullet"/>
+      </w:pPr>
+      <w:r>
+        <w:t>A Discovery Valuation Profile may rank established sufficient alternatives using quantities that are directly represented, mechanically derivable under a declared method, or supplied as measured evidence with provenance. DP does not invent a universal optimization currency.</w:t>
+      </w:r>
+    </w:p>
+    <w:p>
+      <w:pPr>
+        <w:pStyle w:val="ListBullet"/>
+      </w:pPr>
+      <w:r>
+        <w:t>Measured valuation retains scope and uncertainty. A single timing sample or environment-specific observation does not become a universal performance ordering.</w:t>
+      </w:r>
+    </w:p>
+    <w:p>
+      <w:pPr>
+        <w:pStyle w:val="ListBullet"/>
+      </w:pPr>
+      <w:r>
+        <w:t>Mutually exclusive and collectively exhaustive classifications are a high-value search cue: a residual class may be derivable without requiring an independent detector for the current objective, while its semantic representation and any independent evidence remain preserved.</w:t>
+      </w:r>
+    </w:p>
+    <w:p>
+      <w:pPr>
+        <w:pStyle w:val="ListBullet"/>
+      </w:pPr>
+      <w:r>
+        <w:t>The optional Logic Lens for Implicit-Assertion Discovery 0.1 is contextual search guidance only. It can suggest what to test but supplies no semantic premise or authority.</w:t>
+      </w:r>
+    </w:p>
+    <w:p>
+      <w:pPr>
+        <w:pStyle w:val="BodyText"/>
+      </w:pPr>
+      <w:r>
+        <w:t>Planned qualification uses unrelated positive/negative controls, minimal-versus-minimum controls, noisy-measurement controls, QU/DTS authority boundaries, and one blind real-world CPC control. The CPC case is evidence motivating the campaign, not a special-case rule or qualification oracle.</w:t>
+      </w:r>
+    </w:p>
+    <w:p>
+      <w:pPr>
         <w:pStyle w:val="Heading1"/>
       </w:pPr>
       <w:r>
@@ -4618,6 +4762,30 @@
                 <w:sz w:val="16"/>
               </w:rPr>
               <w:t>Discovery Protocols; verification remains separate</w:t>
+            </w:r>
+          </w:p>
+        </w:tc>
+      </w:tr>
+      <w:tr>
+        <w:tc>
+          <w:tcPr>
+            <w:tcW w:type="dxa" w:w="5083"/>
+          </w:tcPr>
+          <w:p>
+            <w:pPr/>
+            <w:r>
+              <w:t>Objective-scoped sufficiency / alternative support / valuation (candidate work)</w:t>
+            </w:r>
+          </w:p>
+        </w:tc>
+        <w:tc>
+          <w:tcPr>
+            <w:tcW w:type="dxa" w:w="5083"/>
+          </w:tcPr>
+          <w:p>
+            <w:pPr/>
+            <w:r>
+              <w:t>DP 0.8 successor candidate + Core 0.19 implicit-support authority as needed; current qualified DP authority remains 0.1–0.7</w:t>
             </w:r>
           </w:p>
         </w:tc>
@@ -5337,6 +5505,41 @@
         </w:tc>
       </w:tr>
       <w:tr>
+        <w:tc>
+          <w:tcPr>
+            <w:tcW w:type="dxa" w:w="3389"/>
+          </w:tcPr>
+          <w:p>
+            <w:pPr/>
+            <w:r>
+              <w:t>DP 0.8 successor candidate</w:t>
+            </w:r>
+          </w:p>
+        </w:tc>
+        <w:tc>
+          <w:tcPr>
+            <w:tcW w:type="dxa" w:w="3389"/>
+          </w:tcPr>
+          <w:p>
+            <w:pPr/>
+            <w:r>
+              <w:t>Candidate specification + qualification plan + non-authoritative logic lens; no promotion qualification run yet</w:t>
+            </w:r>
+          </w:p>
+        </w:tc>
+        <w:tc>
+          <w:tcPr>
+            <w:tcW w:type="dxa" w:w="3389"/>
+          </w:tcPr>
+          <w:p>
+            <w:pPr/>
+            <w:r>
+              <w:t>UNQUALIFIED successor candidate; no authority effect</w:t>
+            </w:r>
+          </w:p>
+        </w:tc>
+      </w:tr>
+      <w:tr>
         <w:trPr>
           <w:cantSplit/>
         </w:trPr>
@@ -5816,7 +6019,7 @@
         <w:pStyle w:val="BodyText"/>
       </w:pPr>
       <w:r>
-        <w:t>Source: FINAL_PRODUCT_MAINTENANCE.md. Status: project operating requirement. The accumulated IsoGraph family reference is a final product and MUST be kept current whenever the current qualified family, promotion state, integration status, native vocabulary authority, authority manifest, or public authority routing materially changes.</w:t>
+        <w:t>Source: FINAL_PRODUCT_MAINTENANCE.md. Status: project operating requirement. The accumulated IsoGraph family reference is a maintained branch product and MUST remain synchronized with family-defining specification, candidate-successor, qualification-routing, native-format, and public family-status changes. This requirement applies before promotion as well as after promotion; unqualified successor material is included only when clearly labeled as unqualified.</w:t>
       </w:r>
     </w:p>
     <w:p>
@@ -5832,7 +6035,7 @@
         <w:pStyle w:val="CodeBlock"/>
       </w:pPr>
       <w:r>
-        <w:t>/IsoGraph/IsoGraph_Family_Reference_Joshua_Oshiro_2026.docx</w:t>
+        <w:t>Repository root: IsoGraph_Family_Reference_Joshua_Oshiro_2026.docx</w:t>
       </w:r>
     </w:p>
     <w:p>
@@ -5856,7 +6059,7 @@
         <w:pStyle w:val="CodeBlock"/>
       </w:pPr>
       <w:r>
-        <w:t>repository authority updated</w:t>
+        <w:t>family-defining branch change recorded</w:t>
       </w:r>
     </w:p>
     <w:p>
@@ -5864,7 +6067,7 @@
         <w:pStyle w:val="CodeBlock"/>
       </w:pPr>
       <w:r>
-        <w:t>+ qualification/provenance recorded</w:t>
+        <w:t>+ qualification/provenance recorded when the change affects qualification or authority</w:t>
       </w:r>
     </w:p>
     <w:p>
@@ -5872,7 +6075,7 @@
         <w:pStyle w:val="CodeBlock"/>
       </w:pPr>
       <w:r>
-        <w:t>+ STATUS / AGENTS / README routing updated as applicable</w:t>
+        <w:t>+ family routing/status documentation updated as applicable</w:t>
       </w:r>
     </w:p>
     <w:p>
@@ -5880,7 +6083,7 @@
         <w:pStyle w:val="CodeBlock"/>
       </w:pPr>
       <w:r>
-        <w:t>+ accumulated final-product DOCX refreshed and visually verified</w:t>
+        <w:t>+ repository-root accumulated final-product DOCX refreshed and visually verified</w:t>
       </w:r>
     </w:p>
     <w:p>
@@ -5888,7 +6091,7 @@
         <w:pStyle w:val="CodeBlock"/>
       </w:pPr>
       <w:r>
-        <w:t>= authority-change work cycle complete</w:t>
+        <w:t>= branch family-sync work cycle complete</w:t>
       </w:r>
     </w:p>
     <w:p>
@@ -5906,7 +6109,7 @@
         <w:ind w:left="317" w:hanging="317"/>
       </w:pPr>
       <w:r>
-        <w:t>1. Read live main before editing the final product.</w:t>
+        <w:t>1. Read the live target branch and current main authority state before editing the final product.</w:t>
       </w:r>
     </w:p>
     <w:p>
@@ -5916,7 +6119,7 @@
         <w:ind w:left="317" w:hanging="317"/>
       </w:pPr>
       <w:r>
-        <w:t>2. Pin the exact main snapshot SHA in the title/status material.</w:t>
+        <w:t>2. Pin the exact qualified-authority snapshot represented by the document. Branch successor material may be included without changing that authority pin when it is explicitly labeled unqualified.</w:t>
       </w:r>
     </w:p>
     <w:p>
@@ -5926,7 +6129,7 @@
         <w:ind w:left="317" w:hanging="317"/>
       </w:pPr>
       <w:r>
-        <w:t>3. Update authority map, affected semantic sections, integration boundaries, hashes, source inventory, and references.</w:t>
+        <w:t>3. Update the authority map, affected family/candidate sections, integration boundaries, hashes, source inventory, and references.</w:t>
       </w:r>
     </w:p>
     <w:p>
@@ -5936,7 +6139,7 @@
         <w:ind w:left="317" w:hanging="317"/>
       </w:pPr>
       <w:r>
-        <w:t>4. Preserve immutable failed/partial historical dispositions.</w:t>
+        <w:t>4. Preserve immutable failed/partial historical dispositions and do not rewrite qualification history.</w:t>
       </w:r>
     </w:p>
     <w:p>
@@ -5946,7 +6149,7 @@
         <w:ind w:left="317" w:hanging="317"/>
       </w:pPr>
       <w:r>
-        <w:t>5. Do not confuse module qualification with full-stack integration qualification.</w:t>
+        <w:t>5. Do not confuse candidate presence, module qualification, and full-stack integration qualification.</w:t>
       </w:r>
     </w:p>
     <w:p>
@@ -5956,7 +6159,15 @@
         <w:ind w:left="317" w:hanging="317"/>
       </w:pPr>
       <w:r>
-        <w:t>6. Render the DOCX and visually inspect every page before replacing the canonical Library file.</w:t>
+        <w:t>6. Render the DOCX and visually inspect every page before committing the repository-root artifact; the Library copy is only a publication mirror.</w:t>
+      </w:r>
+    </w:p>
+    <w:p>
+      <w:pPr>
+        <w:pStyle w:val="BodyText"/>
+      </w:pPr>
+      <w:r>
+        <w:t>7. CI must reject a branch when maintained family-defining source paths change but the repository-root DOCX is unchanged. The guard proves branch-level maintenance participation; content correctness still requires review and visual QA.</w:t>
       </w:r>
     </w:p>
     <w:p>
@@ -7147,6 +7358,52 @@
         </w:tc>
       </w:tr>
       <w:tr>
+        <w:tc>
+          <w:tcPr>
+            <w:tcW w:type="dxa" w:w="2541"/>
+          </w:tcPr>
+          <w:p>
+            <w:pPr/>
+            <w:r>
+              <w:t>DP 0.8 successor</w:t>
+            </w:r>
+          </w:p>
+        </w:tc>
+        <w:tc>
+          <w:tcPr>
+            <w:tcW w:type="dxa" w:w="2541"/>
+          </w:tcPr>
+          <w:p>
+            <w:pPr/>
+            <w:r>
+              <w:t>extensions/discovery/DISCOVERY_PROTOCOLS_0_8_CANDIDATE.md</w:t>
+            </w:r>
+          </w:p>
+        </w:tc>
+        <w:tc>
+          <w:tcPr>
+            <w:tcW w:type="dxa" w:w="2541"/>
+          </w:tcPr>
+          <w:p>
+            <w:pPr/>
+            <w:r>
+              <w:t>unqualified successor candidate</w:t>
+            </w:r>
+          </w:p>
+        </w:tc>
+        <w:tc>
+          <w:tcPr>
+            <w:tcW w:type="dxa" w:w="2541"/>
+          </w:tcPr>
+          <w:p>
+            <w:pPr/>
+            <w:r>
+              <w:t>Git blob 46b94fe4cbd407d6d690980604fe5eb854220f67</w:t>
+            </w:r>
+          </w:p>
+        </w:tc>
+      </w:tr>
+      <w:tr>
         <w:trPr>
           <w:cantSplit/>
         </w:trPr>
@@ -10391,6 +10648,14 @@
         <w:pStyle w:val="BodyText"/>
       </w:pPr>
       <w:r>
+        <w:t>DP 0.8 likewise does not create a second protocol-ID namespace. It adds successor discovery behavior around implicit dependence, sufficient support, objective-relevant analysis slices, alternative sufficient topologies, and application-supplied valuation. It remains unqualified in this edition.</w:t>
+      </w:r>
+    </w:p>
+    <w:p>
+      <w:pPr>
+        <w:pStyle w:val="BodyText"/>
+      </w:pPr>
+      <w:r>
         <w:t>DP 0.7 does not add a competing protocol numbering scheme. It changes how higher-level/derived views are admitted and used: primitive-first support, multiple valid views, QU-preserved unfolding, anti-overclaim rules for cycle/exit/recursion, primitive descent for exact claims, and explicit DTS/NEI boundaries.</w:t>
       </w:r>
     </w:p>
@@ -11265,48 +11530,73 @@
         </w:tc>
       </w:tr>
       <w:tr>
-        <w:trPr>
-          <w:cantSplit/>
-        </w:trPr>
-        <w:tc>
-          <w:tcPr>
-            <w:tcW w:type="dxa" w:w="3240"/>
-            <w:tcMar>
-              <w:top w:w="80" w:type="dxa"/>
-              <w:start w:w="80" w:type="dxa"/>
-              <w:bottom w:w="80" w:type="dxa"/>
-              <w:end w:w="80" w:type="dxa"/>
-            </w:tcMar>
-            <w:vAlign w:val="top"/>
-          </w:tcPr>
-          <w:p>
-            <w:r>
-              <w:rPr>
-                <w:rFonts w:ascii="Aptos" w:hAnsi="Aptos"/>
-                <w:sz w:val="16"/>
-              </w:rPr>
-              <w:t>DP 0.7 positive-control campaign</w:t>
-            </w:r>
-          </w:p>
-        </w:tc>
-        <w:tc>
-          <w:tcPr>
-            <w:tcW w:type="dxa" w:w="6840"/>
-            <w:tcMar>
-              <w:top w:w="80" w:type="dxa"/>
-              <w:start w:w="80" w:type="dxa"/>
-              <w:bottom w:w="80" w:type="dxa"/>
-              <w:end w:w="80" w:type="dxa"/>
-            </w:tcMar>
-            <w:vAlign w:val="top"/>
-          </w:tcPr>
-          <w:p>
-            <w:r>
-              <w:rPr>
-                <w:rFonts w:ascii="Aptos" w:hAnsi="Aptos"/>
-                <w:sz w:val="16"/>
-              </w:rPr>
-              <w:t>research/project-discovery/2026-09-25-dp07-three-positive-controls/</w:t>
+        <w:tc>
+          <w:tcPr>
+            <w:tcW w:type="dxa" w:w="5083"/>
+          </w:tcPr>
+          <w:p>
+            <w:pPr/>
+            <w:r>
+              <w:t>DP 0.8 successor candidate</w:t>
+            </w:r>
+          </w:p>
+        </w:tc>
+        <w:tc>
+          <w:tcPr>
+            <w:tcW w:type="dxa" w:w="5083"/>
+          </w:tcPr>
+          <w:p>
+            <w:pPr/>
+            <w:r>
+              <w:t>extensions/discovery/DISCOVERY_PROTOCOLS_0_8_CANDIDATE.md</w:t>
+            </w:r>
+          </w:p>
+        </w:tc>
+      </w:tr>
+      <w:tr>
+        <w:tc>
+          <w:tcPr>
+            <w:tcW w:type="dxa" w:w="5083"/>
+          </w:tcPr>
+          <w:p>
+            <w:pPr/>
+            <w:r>
+              <w:t>DP 0.8 qualification plan</w:t>
+            </w:r>
+          </w:p>
+        </w:tc>
+        <w:tc>
+          <w:tcPr>
+            <w:tcW w:type="dxa" w:w="5083"/>
+          </w:tcPr>
+          <w:p>
+            <w:pPr/>
+            <w:r>
+              <w:t>qualification/DISCOVERY_PROTOCOLS_0_8_QUALIFICATION_PLAN.md</w:t>
+            </w:r>
+          </w:p>
+        </w:tc>
+      </w:tr>
+      <w:tr>
+        <w:tc>
+          <w:tcPr>
+            <w:tcW w:type="dxa" w:w="5083"/>
+          </w:tcPr>
+          <w:p>
+            <w:pPr/>
+            <w:r>
+              <w:t>DP 0.8 logic lens</w:t>
+            </w:r>
+          </w:p>
+        </w:tc>
+        <w:tc>
+          <w:tcPr>
+            <w:tcW w:type="dxa" w:w="5083"/>
+          </w:tcPr>
+          <w:p>
+            <w:pPr/>
+            <w:r>
+              <w:t>research/discovery/LOGIC_LENS_FOR_IMPLICIT_ASSERTION_DISCOVERY_0_1.md</w:t>
             </w:r>
           </w:p>
         </w:tc>
@@ -11328,7 +11618,11 @@
           </w:tcPr>
           <w:p>
             <w:r>
-              <w:t>Current integration record</w:t>
+              <w:rPr>
+                <w:rFonts w:ascii="Aptos" w:hAnsi="Aptos"/>
+                <w:sz w:val="16"/>
+              </w:rPr>
+              <w:t>DP 0.7 positive-control campaign</w:t>
             </w:r>
           </w:p>
         </w:tc>
@@ -11345,7 +11639,11 @@
           </w:tcPr>
           <w:p>
             <w:r>
-              <w:t>qualification/CURRENT_INTEGRATED_STACK_WITH_CORE_0_19_2026-09-26.md</w:t>
+              <w:rPr>
+                <w:rFonts w:ascii="Aptos" w:hAnsi="Aptos"/>
+                <w:sz w:val="16"/>
+              </w:rPr>
+              <w:t>research/project-discovery/2026-09-25-dp07-three-positive-controls/</w:t>
             </w:r>
           </w:p>
         </w:tc>
@@ -11367,11 +11665,7 @@
           </w:tcPr>
           <w:p>
             <w:r>
-              <w:rPr>
-                <w:rFonts w:ascii="Aptos" w:hAnsi="Aptos"/>
-                <w:sz w:val="16"/>
-              </w:rPr>
-              <w:t>DTS 0.1</w:t>
+              <w:t>Current integration record</w:t>
             </w:r>
           </w:p>
         </w:tc>
@@ -11388,11 +11682,7 @@
           </w:tcPr>
           <w:p>
             <w:r>
-              <w:rPr>
-                <w:rFonts w:ascii="Aptos" w:hAnsi="Aptos"/>
-                <w:sz w:val="16"/>
-              </w:rPr>
-              <w:t>extensions/dts/DETAILED_TRANSITION_SYSTEM_0_1_CANDIDATE.md</w:t>
+              <w:t>qualification/CURRENT_INTEGRATED_STACK_WITH_CORE_0_19_2026-09-26.md</w:t>
             </w:r>
           </w:p>
         </w:tc>
@@ -11418,7 +11708,7 @@
                 <w:rFonts w:ascii="Aptos" w:hAnsi="Aptos"/>
                 <w:sz w:val="16"/>
               </w:rPr>
-              <w:t>DTS qualification</w:t>
+              <w:t>DTS 0.1</w:t>
             </w:r>
           </w:p>
         </w:tc>
@@ -11439,7 +11729,7 @@
                 <w:rFonts w:ascii="Aptos" w:hAnsi="Aptos"/>
                 <w:sz w:val="16"/>
               </w:rPr>
-              <w:t>qualification/DTS_0_1_QUALIFICATION.md</w:t>
+              <w:t>extensions/dts/DETAILED_TRANSITION_SYSTEM_0_1_CANDIDATE.md</w:t>
             </w:r>
           </w:p>
         </w:tc>
@@ -11465,7 +11755,7 @@
                 <w:rFonts w:ascii="Aptos" w:hAnsi="Aptos"/>
                 <w:sz w:val="16"/>
               </w:rPr>
-              <w:t>QRC 0.1</w:t>
+              <w:t>DTS qualification</w:t>
             </w:r>
           </w:p>
         </w:tc>
@@ -11486,7 +11776,7 @@
                 <w:rFonts w:ascii="Aptos" w:hAnsi="Aptos"/>
                 <w:sz w:val="16"/>
               </w:rPr>
-              <w:t>qualification/QUALIFICATION_REJECTION_CONTRACT_0_1_CANDIDATE.md</w:t>
+              <w:t>qualification/DTS_0_1_QUALIFICATION.md</w:t>
             </w:r>
           </w:p>
         </w:tc>
@@ -11512,6 +11802,53 @@
                 <w:rFonts w:ascii="Aptos" w:hAnsi="Aptos"/>
                 <w:sz w:val="16"/>
               </w:rPr>
+              <w:t>QRC 0.1</w:t>
+            </w:r>
+          </w:p>
+        </w:tc>
+        <w:tc>
+          <w:tcPr>
+            <w:tcW w:type="dxa" w:w="6840"/>
+            <w:tcMar>
+              <w:top w:w="80" w:type="dxa"/>
+              <w:start w:w="80" w:type="dxa"/>
+              <w:bottom w:w="80" w:type="dxa"/>
+              <w:end w:w="80" w:type="dxa"/>
+            </w:tcMar>
+            <w:vAlign w:val="top"/>
+          </w:tcPr>
+          <w:p>
+            <w:r>
+              <w:rPr>
+                <w:rFonts w:ascii="Aptos" w:hAnsi="Aptos"/>
+                <w:sz w:val="16"/>
+              </w:rPr>
+              <w:t>qualification/QUALIFICATION_REJECTION_CONTRACT_0_1_CANDIDATE.md</w:t>
+            </w:r>
+          </w:p>
+        </w:tc>
+      </w:tr>
+      <w:tr>
+        <w:trPr>
+          <w:cantSplit/>
+        </w:trPr>
+        <w:tc>
+          <w:tcPr>
+            <w:tcW w:type="dxa" w:w="3240"/>
+            <w:tcMar>
+              <w:top w:w="80" w:type="dxa"/>
+              <w:start w:w="80" w:type="dxa"/>
+              <w:bottom w:w="80" w:type="dxa"/>
+              <w:end w:w="80" w:type="dxa"/>
+            </w:tcMar>
+            <w:vAlign w:val="top"/>
+          </w:tcPr>
+          <w:p>
+            <w:r>
+              <w:rPr>
+                <w:rFonts w:ascii="Aptos" w:hAnsi="Aptos"/>
+                <w:sz w:val="16"/>
+              </w:rPr>
               <w:t>Repository license</w:t>
             </w:r>
           </w:p>
@@ -11553,7 +11890,15 @@
         <w:pStyle w:val="BodyText"/>
       </w:pPr>
       <w:r>
-        <w:t>All repository references in this maintained edition are read against iteathen/IsoGraph main@ef5414b1733b3619356039722a7280cc94ac49d4. If a later current manifest differs from this document, the later exact repository authority controls and this final-product document must be refreshed under FINAL_PRODUCT_MAINTENANCE.md.</w:t>
+        <w:t>Qualified-authority references in this maintained edition are read against iteathen/IsoGraph main@ef5414b1733b3619356039722a7280cc94ac49d4. This branch-maintained edition additionally incorporates the explicitly unqualified DP 0.8 successor material under PR #48. The qualified snapshot remains controlling for current authority; the candidate paths are branch successor material and have no authority effect until qualified and promoted.</w:t>
+      </w:r>
+    </w:p>
+    <w:p>
+      <w:pPr>
+        <w:pStyle w:val="BodyText"/>
+      </w:pPr>
+      <w:r>
+        <w:t>Unqualified successor paths reflected in this edition: extensions/discovery/DISCOVERY_PROTOCOLS_0_8_CANDIDATE.md; qualification/DISCOVERY_PROTOCOLS_0_8_QUALIFICATION_PLAN.md; research/discovery/LOGIC_LENS_FOR_IMPLICIT_ASSERTION_DISCOVERY_0_1.md.</w:t>
       </w:r>
     </w:p>
     <w:p>

</xml_diff>

<commit_message>
Refresh IsoGraph family reference for Core 0.20 and DP 0.8
</commit_message>
<xml_diff>
--- a/IsoGraph_Family_Reference_Joshua_Oshiro_2026.docx
+++ b/IsoGraph_Family_Reference_Joshua_Oshiro_2026.docx
@@ -9,6 +9,162 @@
       </w:pPr>
       <w:r>
         <w:t>IsoGraph Complete Family Reference</w:t>
+      </w:r>
+    </w:p>
+    <w:p>
+      <w:r>
+        <w:br w:type="page"/>
+      </w:r>
+    </w:p>
+    <w:p>
+      <w:pPr>
+        <w:pStyle w:val="Heading1"/>
+      </w:pPr>
+      <w:r>
+        <w:t xml:space="preserve">Current Qualified Authority - 2026-09-28</w:t>
+      </w:r>
+    </w:p>
+    <w:p>
+      <w:r>
+        <w:t xml:space="preserve">Controlling current-status summary for the accumulated IsoGraph family reference. Where an older section below uses the word "current" and conflicts with this section, treat the older wording as a historical snapshot. Exact versioned specifications and qualification records remain semantic authority.</w:t>
+      </w:r>
+    </w:p>
+    <w:p>
+      <w:r>
+        <w:rPr>
+          <w:b/>
+        </w:rPr>
+        <w:t xml:space="preserve">Authority snapshot represented: a3dffccbcdac830789b7a1bb8a2a805bd476d76f</w:t>
+      </w:r>
+    </w:p>
+    <w:p>
+      <w:pPr>
+        <w:pStyle w:val="Heading2"/>
+      </w:pPr>
+      <w:r>
+        <w:t xml:space="preserve">Current effective Core</w:t>
+      </w:r>
+    </w:p>
+    <w:p>
+      <w:r>
+        <w:t xml:space="preserve">Core 0.17 qualified base + Core 0.18 qualified observation-first clarification + Core 0.19 qualified assertion-support/exact-rendering clarification + Core 0.20 qualified primitive-logic-closure clarification.</w:t>
+      </w:r>
+    </w:p>
+    <w:p>
+      <w:r>
+        <w:t xml:space="preserve">Core 0.20 SHA-256: 9a619b552a6ef7719e5b4b5f3a9df4a732ff4377b9bc7b86c385ed5c992b88e7</w:t>
+      </w:r>
+    </w:p>
+    <w:p>
+      <w:r>
+        <w:t xml:space="preserve">Core 0.20 qualification: qualification/CORE_0_20_QUALIFICATION.md; Experiment 048 run 36364086659; 18/18 fresh cases PASS.</w:t>
+      </w:r>
+    </w:p>
+    <w:p>
+      <w:pPr>
+        <w:pStyle w:val="Heading2"/>
+      </w:pPr>
+      <w:r>
+        <w:t xml:space="preserve">Current qualified semantic extensions</w:t>
+      </w:r>
+    </w:p>
+    <w:p>
+      <w:r>
+        <w:t xml:space="preserve">QU 0.1 - SHA-256 1f1510b41e4351726e4d9e714eb32ece0d5e69f0964255aabd7b4a6e94eee4cc.</w:t>
+      </w:r>
+    </w:p>
+    <w:p>
+      <w:r>
+        <w:t xml:space="preserve">NEI 0.4 - SHA-256 6e2f0efb1f4bfbfa55bc2c5597f1ecc5b4d7bb734216543c21ba72089b0aacee.</w:t>
+      </w:r>
+    </w:p>
+    <w:p>
+      <w:r>
+        <w:t xml:space="preserve">Discovery Protocols 0.1-0.8 cumulative current module. DP 0.8 SHA-256 74378de9618b655888a993901e620ca841ae47f3aa406dff1d2dcc92de15fa96. Qualification: qualification/DISCOVERY_PROTOCOLS_0_1_TO_0_8_QUALIFICATION_REVIEW.md; Experiments 050 and 051.</w:t>
+      </w:r>
+    </w:p>
+    <w:p>
+      <w:r>
+        <w:t xml:space="preserve">DTS 0.1 - SHA-256 9d3478f605bc7f673e3dc73f62991a80c50b0eadebe7fbe755689e01452ae4ad.</w:t>
+      </w:r>
+    </w:p>
+    <w:p>
+      <w:pPr>
+        <w:pStyle w:val="Heading2"/>
+      </w:pPr>
+      <w:r>
+        <w:t xml:space="preserve">Current integrated stack</w:t>
+      </w:r>
+    </w:p>
+    <w:p>
+      <w:r>
+        <w:t xml:space="preserve">Core 0.17 + Core 0.18 + Core 0.19 + Core 0.20 + QU 0.1 + NEI 0.4 + Discovery Protocols 0.1-0.8 + DTS 0.1.</w:t>
+      </w:r>
+    </w:p>
+    <w:p>
+      <w:r>
+        <w:t xml:space="preserve">Direct integration qualification: Experiment 052 run 36365347906; 16/16 fresh integration cases PASS; all scoring guards true; all module assessments SUPPORTED.</w:t>
+      </w:r>
+    </w:p>
+    <w:p>
+      <w:r>
+        <w:t xml:space="preserve">Authority record: qualification/CURRENT_INTEGRATED_STACK_WITH_CORE_0_20_DP_0_8_2026-09-28.md.</w:t>
+      </w:r>
+    </w:p>
+    <w:p>
+      <w:r>
+        <w:t xml:space="preserve">Current routing manifest: qualification/QUALIFIED_MODULES_2026-09-28.md.</w:t>
+      </w:r>
+    </w:p>
+    <w:p>
+      <w:pPr>
+        <w:pStyle w:val="Heading2"/>
+      </w:pPr>
+      <w:r>
+        <w:t xml:space="preserve">Important boundaries</w:t>
+      </w:r>
+    </w:p>
+    <w:p>
+      <w:r>
+        <w:t xml:space="preserve">DP remains discovery/search/discrepancy guidance and is not proof authority. QU, NEI, DTS, and Core retain their separate semantic ownership.</w:t>
+      </w:r>
+    </w:p>
+    <w:p>
+      <w:r>
+        <w:t xml:space="preserve">Core 0.20 does not retroactively invalidate artifacts that were correctly qualified under earlier Core revisions; it changes the closure standard for claims of Core-0.20 primitive completeness.</w:t>
+      </w:r>
+    </w:p>
+    <w:p>
+      <w:r>
+        <w:t xml:space="preserve">The historical _CANDIDATE filename suffix does not indicate current qualification status; use exact hashes and the current authority manifest.</w:t>
+      </w:r>
+    </w:p>
+    <w:p>
+      <w:r>
+        <w:t xml:space="preserve">Transition Structural Signatures and DTS mechanism/cost/concurrency/optimization profiles remain separately versioned successor research.</w:t>
+      </w:r>
+    </w:p>
+    <w:p>
+      <w:pPr>
+        <w:pStyle w:val="Heading2"/>
+      </w:pPr>
+      <w:r>
+        <w:t xml:space="preserve">Qualification evidence notes</w:t>
+      </w:r>
+    </w:p>
+    <w:p>
+      <w:r>
+        <w:t xml:space="preserve">Earlier failed/partial qualification attempts remain immutable evidence. Core 0.20 qualification preserved public-schema and provider-truncation failures before the successful run. DP 0.8 qualification preserved an over-constrained bookkeeping-label oracle and an underdetermined control rather than rewriting them.</w:t>
+      </w:r>
+    </w:p>
+    <w:p>
+      <w:r>
+        <w:t xml:space="preserve">This DOCX is a maintained convenience/final reference product. It does not replace the exact versioned semantic specifications, qualification records, manifests, and frozen experiment evidence.</w:t>
+      </w:r>
+    </w:p>
+    <w:p>
+      <w:r>
+        <w:br w:type="page"/>
       </w:r>
     </w:p>
     <w:p>

</xml_diff>

<commit_message>
Qualify Core 0.20, DP 0.8, and current integrated IsoGraph stack (#55)
Promote the reviewed exact Core 0.20 and DP 0.8 revisions, their direct Experiment 052 integration evidence, and current authority routing. Preserve the qualification branch for revision-level provenance.
</commit_message>
<xml_diff>
--- a/IsoGraph_Family_Reference_Joshua_Oshiro_2026.docx
+++ b/IsoGraph_Family_Reference_Joshua_Oshiro_2026.docx
@@ -9,6 +9,162 @@
       </w:pPr>
       <w:r>
         <w:t>IsoGraph Complete Family Reference</w:t>
+      </w:r>
+    </w:p>
+    <w:p>
+      <w:r>
+        <w:br w:type="page"/>
+      </w:r>
+    </w:p>
+    <w:p>
+      <w:pPr>
+        <w:pStyle w:val="Heading1"/>
+      </w:pPr>
+      <w:r>
+        <w:t xml:space="preserve">Current Qualified Authority - 2026-09-28</w:t>
+      </w:r>
+    </w:p>
+    <w:p>
+      <w:r>
+        <w:t xml:space="preserve">Controlling current-status summary for the accumulated IsoGraph family reference. Where an older section below uses the word "current" and conflicts with this section, treat the older wording as a historical snapshot. Exact versioned specifications and qualification records remain semantic authority.</w:t>
+      </w:r>
+    </w:p>
+    <w:p>
+      <w:r>
+        <w:rPr>
+          <w:b/>
+        </w:rPr>
+        <w:t xml:space="preserve">Authority snapshot represented: a3dffccbcdac830789b7a1bb8a2a805bd476d76f</w:t>
+      </w:r>
+    </w:p>
+    <w:p>
+      <w:pPr>
+        <w:pStyle w:val="Heading2"/>
+      </w:pPr>
+      <w:r>
+        <w:t xml:space="preserve">Current effective Core</w:t>
+      </w:r>
+    </w:p>
+    <w:p>
+      <w:r>
+        <w:t xml:space="preserve">Core 0.17 qualified base + Core 0.18 qualified observation-first clarification + Core 0.19 qualified assertion-support/exact-rendering clarification + Core 0.20 qualified primitive-logic-closure clarification.</w:t>
+      </w:r>
+    </w:p>
+    <w:p>
+      <w:r>
+        <w:t xml:space="preserve">Core 0.20 SHA-256: 9a619b552a6ef7719e5b4b5f3a9df4a732ff4377b9bc7b86c385ed5c992b88e7</w:t>
+      </w:r>
+    </w:p>
+    <w:p>
+      <w:r>
+        <w:t xml:space="preserve">Core 0.20 qualification: qualification/CORE_0_20_QUALIFICATION.md; Experiment 048 run 36364086659; 18/18 fresh cases PASS.</w:t>
+      </w:r>
+    </w:p>
+    <w:p>
+      <w:pPr>
+        <w:pStyle w:val="Heading2"/>
+      </w:pPr>
+      <w:r>
+        <w:t xml:space="preserve">Current qualified semantic extensions</w:t>
+      </w:r>
+    </w:p>
+    <w:p>
+      <w:r>
+        <w:t xml:space="preserve">QU 0.1 - SHA-256 1f1510b41e4351726e4d9e714eb32ece0d5e69f0964255aabd7b4a6e94eee4cc.</w:t>
+      </w:r>
+    </w:p>
+    <w:p>
+      <w:r>
+        <w:t xml:space="preserve">NEI 0.4 - SHA-256 6e2f0efb1f4bfbfa55bc2c5597f1ecc5b4d7bb734216543c21ba72089b0aacee.</w:t>
+      </w:r>
+    </w:p>
+    <w:p>
+      <w:r>
+        <w:t xml:space="preserve">Discovery Protocols 0.1-0.8 cumulative current module. DP 0.8 SHA-256 74378de9618b655888a993901e620ca841ae47f3aa406dff1d2dcc92de15fa96. Qualification: qualification/DISCOVERY_PROTOCOLS_0_1_TO_0_8_QUALIFICATION_REVIEW.md; Experiments 050 and 051.</w:t>
+      </w:r>
+    </w:p>
+    <w:p>
+      <w:r>
+        <w:t xml:space="preserve">DTS 0.1 - SHA-256 9d3478f605bc7f673e3dc73f62991a80c50b0eadebe7fbe755689e01452ae4ad.</w:t>
+      </w:r>
+    </w:p>
+    <w:p>
+      <w:pPr>
+        <w:pStyle w:val="Heading2"/>
+      </w:pPr>
+      <w:r>
+        <w:t xml:space="preserve">Current integrated stack</w:t>
+      </w:r>
+    </w:p>
+    <w:p>
+      <w:r>
+        <w:t xml:space="preserve">Core 0.17 + Core 0.18 + Core 0.19 + Core 0.20 + QU 0.1 + NEI 0.4 + Discovery Protocols 0.1-0.8 + DTS 0.1.</w:t>
+      </w:r>
+    </w:p>
+    <w:p>
+      <w:r>
+        <w:t xml:space="preserve">Direct integration qualification: Experiment 052 run 36365347906; 16/16 fresh integration cases PASS; all scoring guards true; all module assessments SUPPORTED.</w:t>
+      </w:r>
+    </w:p>
+    <w:p>
+      <w:r>
+        <w:t xml:space="preserve">Authority record: qualification/CURRENT_INTEGRATED_STACK_WITH_CORE_0_20_DP_0_8_2026-09-28.md.</w:t>
+      </w:r>
+    </w:p>
+    <w:p>
+      <w:r>
+        <w:t xml:space="preserve">Current routing manifest: qualification/QUALIFIED_MODULES_2026-09-28.md.</w:t>
+      </w:r>
+    </w:p>
+    <w:p>
+      <w:pPr>
+        <w:pStyle w:val="Heading2"/>
+      </w:pPr>
+      <w:r>
+        <w:t xml:space="preserve">Important boundaries</w:t>
+      </w:r>
+    </w:p>
+    <w:p>
+      <w:r>
+        <w:t xml:space="preserve">DP remains discovery/search/discrepancy guidance and is not proof authority. QU, NEI, DTS, and Core retain their separate semantic ownership.</w:t>
+      </w:r>
+    </w:p>
+    <w:p>
+      <w:r>
+        <w:t xml:space="preserve">Core 0.20 does not retroactively invalidate artifacts that were correctly qualified under earlier Core revisions; it changes the closure standard for claims of Core-0.20 primitive completeness.</w:t>
+      </w:r>
+    </w:p>
+    <w:p>
+      <w:r>
+        <w:t xml:space="preserve">The historical _CANDIDATE filename suffix does not indicate current qualification status; use exact hashes and the current authority manifest.</w:t>
+      </w:r>
+    </w:p>
+    <w:p>
+      <w:r>
+        <w:t xml:space="preserve">Transition Structural Signatures and DTS mechanism/cost/concurrency/optimization profiles remain separately versioned successor research.</w:t>
+      </w:r>
+    </w:p>
+    <w:p>
+      <w:pPr>
+        <w:pStyle w:val="Heading2"/>
+      </w:pPr>
+      <w:r>
+        <w:t xml:space="preserve">Qualification evidence notes</w:t>
+      </w:r>
+    </w:p>
+    <w:p>
+      <w:r>
+        <w:t xml:space="preserve">Earlier failed/partial qualification attempts remain immutable evidence. Core 0.20 qualification preserved public-schema and provider-truncation failures before the successful run. DP 0.8 qualification preserved an over-constrained bookkeeping-label oracle and an underdetermined control rather than rewriting them.</w:t>
+      </w:r>
+    </w:p>
+    <w:p>
+      <w:r>
+        <w:t xml:space="preserve">This DOCX is a maintained convenience/final reference product. It does not replace the exact versioned semantic specifications, qualification records, manifests, and frozen experiment evidence.</w:t>
+      </w:r>
+    </w:p>
+    <w:p>
+      <w:r>
+        <w:br w:type="page"/>
       </w:r>
     </w:p>
     <w:p>

</xml_diff>

<commit_message>
Refresh IsoGraph family reference for DP 0.10 and EI 0.1
</commit_message>
<xml_diff>
--- a/IsoGraph_Family_Reference_Joshua_Oshiro_2026.docx
+++ b/IsoGraph_Family_Reference_Joshua_Oshiro_2026.docx
@@ -9,6 +9,175 @@
       </w:pPr>
       <w:r>
         <w:t>IsoGraph Complete Family Reference</w:t>
+      </w:r>
+    </w:p>
+    <w:p>
+      <w:r>
+        <w:br w:type="page"/>
+      </w:r>
+    </w:p>
+    <w:p>
+      <w:pPr>
+        <w:pStyle w:val="Heading1"/>
+      </w:pPr>
+      <w:r>
+        <w:t xml:space="preserve">Current Qualified Authority - 2026-09-29</w:t>
+      </w:r>
+    </w:p>
+    <w:p>
+      <w:r>
+        <w:t xml:space="preserve">Controlling current-status summary for the accumulated IsoGraph family reference. Older current-status sections below are historical snapshots. Exact versioned specifications and qualification records remain authority.</w:t>
+      </w:r>
+    </w:p>
+    <w:p>
+      <w:r>
+        <w:rPr>
+          <w:b/>
+        </w:rPr>
+        <w:t xml:space="preserve">Authority snapshot represented: d242a183c142bd6e9b1f9240495972e30ad9f657</w:t>
+      </w:r>
+    </w:p>
+    <w:p>
+      <w:pPr>
+        <w:pStyle w:val="Heading2"/>
+      </w:pPr>
+      <w:r>
+        <w:t xml:space="preserve">Current effective Core</w:t>
+      </w:r>
+    </w:p>
+    <w:p>
+      <w:r>
+        <w:t xml:space="preserve">Core 0.17 qualified base + Core 0.18 observation-first clarification + Core 0.19 assertion-support/exact-rendering clarification + Core 0.20 primitive-logic-closure clarification.</w:t>
+      </w:r>
+    </w:p>
+    <w:p>
+      <w:r>
+        <w:t xml:space="preserve">Core 0.20 SHA-256: 9a619b552a6ef7719e5b4b5f3a9df4a732ff4377b9bc7b86c385ed5c992b88e7.</w:t>
+      </w:r>
+    </w:p>
+    <w:p>
+      <w:pPr>
+        <w:pStyle w:val="Heading2"/>
+      </w:pPr>
+      <w:r>
+        <w:t xml:space="preserve">Current qualified extensions and modules</w:t>
+      </w:r>
+    </w:p>
+    <w:p>
+      <w:r>
+        <w:t xml:space="preserve">QU 0.1 - SHA-256 1f1510b41e4351726e4d9e714eb32ece0d5e69f0964255aabd7b4a6e94eee4cc.</w:t>
+      </w:r>
+    </w:p>
+    <w:p>
+      <w:r>
+        <w:t xml:space="preserve">NEI 0.4 - SHA-256 6e2f0efb1f4bfbfa55bc2c5597f1ecc5b4d7bb734216543c21ba72089b0aacee.</w:t>
+      </w:r>
+    </w:p>
+    <w:p>
+      <w:r>
+        <w:t xml:space="preserve">DTS 0.1 - SHA-256 9d3478f605bc7f673e3dc73f62991a80c50b0eadebe7fbe755689e01452ae4ad.</w:t>
+      </w:r>
+    </w:p>
+    <w:p>
+      <w:r>
+        <w:t xml:space="preserve">Discovery Protocols 0.1-0.10 are the cumulative current discovery module. DP 0.9 Minimum Sufficient Support / Valuation SHA-256: 4d6ed98288863ccd50e9cbccf2e626ff241aded3bd9fb534e0fb74ad147858ea. DP 0.10 Experimental Warrant SHA-256: 108f3998bba90aff6a386335aeb45fde663d4be0b32643a06e01fb039bff61ec.</w:t>
+      </w:r>
+    </w:p>
+    <w:p>
+      <w:r>
+        <w:t xml:space="preserve">Experimental Inquiry 0.1 - SHA-256 b94262d7384603072d0e7a2657b84f6c427e7098cea051948702c367a440c666.</w:t>
+      </w:r>
+    </w:p>
+    <w:p>
+      <w:pPr>
+        <w:pStyle w:val="Heading2"/>
+      </w:pPr>
+      <w:r>
+        <w:t xml:space="preserve">Current qualification evidence</w:t>
+      </w:r>
+    </w:p>
+    <w:p>
+      <w:r>
+        <w:t xml:space="preserve">Experiment 053: DP 0.9, 20/20 fresh cases PASS, formal QUALIFIES.</w:t>
+      </w:r>
+    </w:p>
+    <w:p>
+      <w:r>
+        <w:t xml:space="preserve">Experiment 054: DP 0.10 Experimental Warrant, 18/18 fresh cases PASS, formal QUALIFIES.</w:t>
+      </w:r>
+    </w:p>
+    <w:p>
+      <w:r>
+        <w:t xml:space="preserve">Experiment 055: Experimental Inquiry 0.1, 18/18 fresh cases PASS, formal QUALIFIES.</w:t>
+      </w:r>
+    </w:p>
+    <w:p>
+      <w:r>
+        <w:t xml:space="preserve">Experiment 056: expanded-family integration, 16/16 fresh cases PASS; all guards true; all module assessments SUPPORTED; formal QUALIFIES.</w:t>
+      </w:r>
+    </w:p>
+    <w:p>
+      <w:pPr>
+        <w:pStyle w:val="Heading2"/>
+      </w:pPr>
+      <w:r>
+        <w:t xml:space="preserve">Current integrated stack</w:t>
+      </w:r>
+    </w:p>
+    <w:p>
+      <w:r>
+        <w:t xml:space="preserve">Core 0.17 + Core 0.18 + Core 0.19 + Core 0.20 + QU 0.1 + NEI 0.4 + Discovery Protocols 0.1-0.10 + DTS 0.1 + Experimental Inquiry 0.1.</w:t>
+      </w:r>
+    </w:p>
+    <w:p>
+      <w:r>
+        <w:t xml:space="preserve">Current authority record: qualification/CURRENT_INTEGRATED_STACK_WITH_DP_0_10_EI_0_1_2026-09-29.md.</w:t>
+      </w:r>
+    </w:p>
+    <w:p>
+      <w:r>
+        <w:t xml:space="preserve">Current routing manifest: qualification/QUALIFIED_MODULES_2026-09-29.md.</w:t>
+      </w:r>
+    </w:p>
+    <w:p>
+      <w:pPr>
+        <w:pStyle w:val="Heading2"/>
+      </w:pPr>
+      <w:r>
+        <w:t xml:space="preserve">Authority boundaries</w:t>
+      </w:r>
+    </w:p>
+    <w:p>
+      <w:r>
+        <w:t xml:space="preserve">Core owns exact semantic admission and primitive support. QU owns represented structured known-unknown possibility. NEI owns natural/domain identity. DTS owns transition anatomy. DP owns discovery/search, sufficiency/valuation and Experimental Warrants. EI owns active experiment construction and observation generation under a warrant.</w:t>
+      </w:r>
+    </w:p>
+    <w:p>
+      <w:r>
+        <w:t xml:space="preserve">An Experimental Warrant is permission to inquire, not support for a hypothesis. EI observations are evidence, not truth by themselves. Open-world model incompleteness is separate from QU and supplies no semantic premise. Adaptive and post-hoc evidence retains its provenance. Negative experimental results are limited to demonstrated coverage.</w:t>
+      </w:r>
+    </w:p>
+    <w:p>
+      <w:pPr>
+        <w:pStyle w:val="Heading2"/>
+      </w:pPr>
+      <w:r>
+        <w:t xml:space="preserve">Historical and cleanup status</w:t>
+      </w:r>
+    </w:p>
+    <w:p>
+      <w:r>
+        <w:t xml:space="preserve">Earlier failed and infrastructure-only qualification attempts remain immutable evidence. The Core 0.19 qualification archive and externally referenced Navier-Stokes compatibility branch remain intentionally retained; stale development branches were retired under the 2026-09-29 cleanup record.</w:t>
+      </w:r>
+    </w:p>
+    <w:p>
+      <w:r>
+        <w:t xml:space="preserve">This DOCX is the maintained accumulated convenience/final reference product. It does not replace exact versioned specifications, qualification records, manifests, or frozen experiment evidence.</w:t>
+      </w:r>
+    </w:p>
+    <w:p>
+      <w:r>
+        <w:br w:type="page"/>
       </w:r>
     </w:p>
     <w:p>

</xml_diff>

<commit_message>
Integrate Experimental Inquiry family successor and cleanup (#61)
Qualify DP 0.9 MSS/valuation, DP 0.10 Experimental Warrant, and Experimental Inquiry 0.1; integration-qualify the expanded IsoGraph family; retire stale branches; synchronize current authority routing; refresh and visually verify the maintained family reference; preserve historical evidence and authority boundaries.
</commit_message>
<xml_diff>
--- a/IsoGraph_Family_Reference_Joshua_Oshiro_2026.docx
+++ b/IsoGraph_Family_Reference_Joshua_Oshiro_2026.docx
@@ -9,6 +9,175 @@
       </w:pPr>
       <w:r>
         <w:t>IsoGraph Complete Family Reference</w:t>
+      </w:r>
+    </w:p>
+    <w:p>
+      <w:r>
+        <w:br w:type="page"/>
+      </w:r>
+    </w:p>
+    <w:p>
+      <w:pPr>
+        <w:pStyle w:val="Heading1"/>
+      </w:pPr>
+      <w:r>
+        <w:t xml:space="preserve">Current Qualified Authority - 2026-09-29</w:t>
+      </w:r>
+    </w:p>
+    <w:p>
+      <w:r>
+        <w:t xml:space="preserve">Controlling current-status summary for the accumulated IsoGraph family reference. Older current-status sections below are historical snapshots. Exact versioned specifications and qualification records remain authority.</w:t>
+      </w:r>
+    </w:p>
+    <w:p>
+      <w:r>
+        <w:rPr>
+          <w:b/>
+        </w:rPr>
+        <w:t xml:space="preserve">Authority snapshot represented: d242a183c142bd6e9b1f9240495972e30ad9f657</w:t>
+      </w:r>
+    </w:p>
+    <w:p>
+      <w:pPr>
+        <w:pStyle w:val="Heading2"/>
+      </w:pPr>
+      <w:r>
+        <w:t xml:space="preserve">Current effective Core</w:t>
+      </w:r>
+    </w:p>
+    <w:p>
+      <w:r>
+        <w:t xml:space="preserve">Core 0.17 qualified base + Core 0.18 observation-first clarification + Core 0.19 assertion-support/exact-rendering clarification + Core 0.20 primitive-logic-closure clarification.</w:t>
+      </w:r>
+    </w:p>
+    <w:p>
+      <w:r>
+        <w:t xml:space="preserve">Core 0.20 SHA-256: 9a619b552a6ef7719e5b4b5f3a9df4a732ff4377b9bc7b86c385ed5c992b88e7.</w:t>
+      </w:r>
+    </w:p>
+    <w:p>
+      <w:pPr>
+        <w:pStyle w:val="Heading2"/>
+      </w:pPr>
+      <w:r>
+        <w:t xml:space="preserve">Current qualified extensions and modules</w:t>
+      </w:r>
+    </w:p>
+    <w:p>
+      <w:r>
+        <w:t xml:space="preserve">QU 0.1 - SHA-256 1f1510b41e4351726e4d9e714eb32ece0d5e69f0964255aabd7b4a6e94eee4cc.</w:t>
+      </w:r>
+    </w:p>
+    <w:p>
+      <w:r>
+        <w:t xml:space="preserve">NEI 0.4 - SHA-256 6e2f0efb1f4bfbfa55bc2c5597f1ecc5b4d7bb734216543c21ba72089b0aacee.</w:t>
+      </w:r>
+    </w:p>
+    <w:p>
+      <w:r>
+        <w:t xml:space="preserve">DTS 0.1 - SHA-256 9d3478f605bc7f673e3dc73f62991a80c50b0eadebe7fbe755689e01452ae4ad.</w:t>
+      </w:r>
+    </w:p>
+    <w:p>
+      <w:r>
+        <w:t xml:space="preserve">Discovery Protocols 0.1-0.10 are the cumulative current discovery module. DP 0.9 Minimum Sufficient Support / Valuation SHA-256: 4d6ed98288863ccd50e9cbccf2e626ff241aded3bd9fb534e0fb74ad147858ea. DP 0.10 Experimental Warrant SHA-256: 108f3998bba90aff6a386335aeb45fde663d4be0b32643a06e01fb039bff61ec.</w:t>
+      </w:r>
+    </w:p>
+    <w:p>
+      <w:r>
+        <w:t xml:space="preserve">Experimental Inquiry 0.1 - SHA-256 b94262d7384603072d0e7a2657b84f6c427e7098cea051948702c367a440c666.</w:t>
+      </w:r>
+    </w:p>
+    <w:p>
+      <w:pPr>
+        <w:pStyle w:val="Heading2"/>
+      </w:pPr>
+      <w:r>
+        <w:t xml:space="preserve">Current qualification evidence</w:t>
+      </w:r>
+    </w:p>
+    <w:p>
+      <w:r>
+        <w:t xml:space="preserve">Experiment 053: DP 0.9, 20/20 fresh cases PASS, formal QUALIFIES.</w:t>
+      </w:r>
+    </w:p>
+    <w:p>
+      <w:r>
+        <w:t xml:space="preserve">Experiment 054: DP 0.10 Experimental Warrant, 18/18 fresh cases PASS, formal QUALIFIES.</w:t>
+      </w:r>
+    </w:p>
+    <w:p>
+      <w:r>
+        <w:t xml:space="preserve">Experiment 055: Experimental Inquiry 0.1, 18/18 fresh cases PASS, formal QUALIFIES.</w:t>
+      </w:r>
+    </w:p>
+    <w:p>
+      <w:r>
+        <w:t xml:space="preserve">Experiment 056: expanded-family integration, 16/16 fresh cases PASS; all guards true; all module assessments SUPPORTED; formal QUALIFIES.</w:t>
+      </w:r>
+    </w:p>
+    <w:p>
+      <w:pPr>
+        <w:pStyle w:val="Heading2"/>
+      </w:pPr>
+      <w:r>
+        <w:t xml:space="preserve">Current integrated stack</w:t>
+      </w:r>
+    </w:p>
+    <w:p>
+      <w:r>
+        <w:t xml:space="preserve">Core 0.17 + Core 0.18 + Core 0.19 + Core 0.20 + QU 0.1 + NEI 0.4 + Discovery Protocols 0.1-0.10 + DTS 0.1 + Experimental Inquiry 0.1.</w:t>
+      </w:r>
+    </w:p>
+    <w:p>
+      <w:r>
+        <w:t xml:space="preserve">Current authority record: qualification/CURRENT_INTEGRATED_STACK_WITH_DP_0_10_EI_0_1_2026-09-29.md.</w:t>
+      </w:r>
+    </w:p>
+    <w:p>
+      <w:r>
+        <w:t xml:space="preserve">Current routing manifest: qualification/QUALIFIED_MODULES_2026-09-29.md.</w:t>
+      </w:r>
+    </w:p>
+    <w:p>
+      <w:pPr>
+        <w:pStyle w:val="Heading2"/>
+      </w:pPr>
+      <w:r>
+        <w:t xml:space="preserve">Authority boundaries</w:t>
+      </w:r>
+    </w:p>
+    <w:p>
+      <w:r>
+        <w:t xml:space="preserve">Core owns exact semantic admission and primitive support. QU owns represented structured known-unknown possibility. NEI owns natural/domain identity. DTS owns transition anatomy. DP owns discovery/search, sufficiency/valuation and Experimental Warrants. EI owns active experiment construction and observation generation under a warrant.</w:t>
+      </w:r>
+    </w:p>
+    <w:p>
+      <w:r>
+        <w:t xml:space="preserve">An Experimental Warrant is permission to inquire, not support for a hypothesis. EI observations are evidence, not truth by themselves. Open-world model incompleteness is separate from QU and supplies no semantic premise. Adaptive and post-hoc evidence retains its provenance. Negative experimental results are limited to demonstrated coverage.</w:t>
+      </w:r>
+    </w:p>
+    <w:p>
+      <w:pPr>
+        <w:pStyle w:val="Heading2"/>
+      </w:pPr>
+      <w:r>
+        <w:t xml:space="preserve">Historical and cleanup status</w:t>
+      </w:r>
+    </w:p>
+    <w:p>
+      <w:r>
+        <w:t xml:space="preserve">Earlier failed and infrastructure-only qualification attempts remain immutable evidence. The Core 0.19 qualification archive and externally referenced Navier-Stokes compatibility branch remain intentionally retained; stale development branches were retired under the 2026-09-29 cleanup record.</w:t>
+      </w:r>
+    </w:p>
+    <w:p>
+      <w:r>
+        <w:t xml:space="preserve">This DOCX is the maintained accumulated convenience/final reference product. It does not replace exact versioned specifications, qualification records, manifests, or frozen experiment evidence.</w:t>
+      </w:r>
+    </w:p>
+    <w:p>
+      <w:r>
+        <w:br w:type="page"/>
       </w:r>
     </w:p>
     <w:p>

</xml_diff>

<commit_message>
Refresh IsoGraph family reference for Core 0.21
</commit_message>
<xml_diff>
--- a/IsoGraph_Family_Reference_Joshua_Oshiro_2026.docx
+++ b/IsoGraph_Family_Reference_Joshua_Oshiro_2026.docx
@@ -21,6 +21,193 @@
         <w:pStyle w:val="Heading1"/>
       </w:pPr>
       <w:r>
+        <w:t xml:space="preserve">Current Qualified Authority - 2026-09-29 Core 0.21</w:t>
+      </w:r>
+    </w:p>
+    <w:p>
+      <w:r>
+        <w:t xml:space="preserve">Controlling current-status summary for the accumulated IsoGraph family reference. Older current-status sections below remain historical snapshots. Exact versioned specifications and qualification records remain authority.</w:t>
+      </w:r>
+    </w:p>
+    <w:p>
+      <w:r>
+        <w:rPr>
+          <w:b/>
+        </w:rPr>
+        <w:t xml:space="preserve">Authority snapshot represented: 20fb41c3a3427f94a8da0b663ebc80ab0f2dc401</w:t>
+      </w:r>
+    </w:p>
+    <w:p>
+      <w:pPr>
+        <w:pStyle w:val="Heading2"/>
+      </w:pPr>
+      <w:r>
+        <w:t xml:space="preserve">Current effective Core</w:t>
+      </w:r>
+    </w:p>
+    <w:p>
+      <w:r>
+        <w:t xml:space="preserve">Core 0.17 qualified base + Core 0.18 observation-first clarification + Core 0.19 assertion-support/exact-rendering clarification + Core 0.20 primitive-logic-closure clarification + Core 0.21 rendering-conservation/schema-closure clarification.</w:t>
+      </w:r>
+    </w:p>
+    <w:p>
+      <w:r>
+        <w:t xml:space="preserve">Core 0.21 SHA-256: f76bc94748ab5f970fe6b21ae4734919df241912c7e5e13e07177896e5f01820.</w:t>
+      </w:r>
+    </w:p>
+    <w:p>
+      <w:pPr>
+        <w:pStyle w:val="Heading2"/>
+      </w:pPr>
+      <w:r>
+        <w:t xml:space="preserve">Core 0.21 key additions</w:t>
+      </w:r>
+    </w:p>
+    <w:p>
+      <w:r>
+        <w:t xml:space="preserve">Core 0.21 freezes a Source Semantic Census, forbids qualification by silent scope shrinkage, requires assertion-body/support/dependency closure, defines exact Schema Closure for generative semantics without exhaustive materialization, separates unresolved termination from known step semantics, and invalidates current IA fixed points when their load-bearing representation tuple changes.</w:t>
+      </w:r>
+    </w:p>
+    <w:p>
+      <w:r>
+        <w:t xml:space="preserve">Strict Core 0.21 qualification requires separate soundness, coverage, reconstruction, scope-integrity, and authority-routing gates plus a mechanically derived closure ledger. The ledger checker is qualification infrastructure, not semantic proof authority.</w:t>
+      </w:r>
+    </w:p>
+    <w:p>
+      <w:pPr>
+        <w:pStyle w:val="Heading2"/>
+      </w:pPr>
+      <w:r>
+        <w:t xml:space="preserve">Current qualified extensions and modules</w:t>
+      </w:r>
+    </w:p>
+    <w:p>
+      <w:r>
+        <w:t xml:space="preserve">QU 0.1 - SHA-256 1f1510b41e4351726e4d9e714eb32ece0d5e69f0964255aabd7b4a6e94eee4cc.</w:t>
+      </w:r>
+    </w:p>
+    <w:p>
+      <w:r>
+        <w:t xml:space="preserve">NEI 0.4 - SHA-256 6e2f0efb1f4bfbfa55bc2c5597f1ecc5b4d7bb734216543c21ba72089b0aacee.</w:t>
+      </w:r>
+    </w:p>
+    <w:p>
+      <w:r>
+        <w:t xml:space="preserve">DTS 0.1 - SHA-256 9d3478f605bc7f673e3dc73f62991a80c50b0eadebe7fbe755689e01452ae4ad.</w:t>
+      </w:r>
+    </w:p>
+    <w:p>
+      <w:r>
+        <w:t xml:space="preserve">Discovery Protocols 0.1-0.10 remain the cumulative current discovery module. DP 0.9 SHA-256: 4d6ed98288863ccd50e9cbccf2e626ff241aded3bd9fb534e0fb74ad147858ea. DP 0.10 SHA-256: 108f3998bba90aff6a386335aeb45fde663d4be0b32643a06e01fb039bff61ec.</w:t>
+      </w:r>
+    </w:p>
+    <w:p>
+      <w:r>
+        <w:t xml:space="preserve">Experimental Inquiry 0.1 - SHA-256 b94262d7384603072d0e7a2657b84f6c427e7098cea051948702c367a440c666.</w:t>
+      </w:r>
+    </w:p>
+    <w:p>
+      <w:pPr>
+        <w:pStyle w:val="Heading2"/>
+      </w:pPr>
+      <w:r>
+        <w:t xml:space="preserve">Core 0.21 qualification evidence</w:t>
+      </w:r>
+    </w:p>
+    <w:p>
+      <w:r>
+        <w:t xml:space="preserve">Experiment 057 Attempt 2: C01-C25 PASS; C26 preserved as a public field-semantics ambiguity and not retroactively rescored.</w:t>
+      </w:r>
+    </w:p>
+    <w:p>
+      <w:r>
+        <w:t xml:space="preserve">Experiment 058: fresh target-26 authority-boundary replacement, 1/1 PASS, formal QUALIFIES.</w:t>
+      </w:r>
+    </w:p>
+    <w:p>
+      <w:r>
+        <w:t xml:space="preserve">Core 0.21 qualification: qualification/CORE_0_21_QUALIFICATION.md.</w:t>
+      </w:r>
+    </w:p>
+    <w:p>
+      <w:pPr>
+        <w:pStyle w:val="Heading2"/>
+      </w:pPr>
+      <w:r>
+        <w:t xml:space="preserve">Current expanded-family integration</w:t>
+      </w:r>
+    </w:p>
+    <w:p>
+      <w:r>
+        <w:t xml:space="preserve">Experiment 059 Attempt 1: I01-I15 PASS; I16 preserved as an ownership-field ambiguity and not retroactively rescored.</w:t>
+      </w:r>
+    </w:p>
+    <w:p>
+      <w:r>
+        <w:t xml:space="preserve">Experiment 060: fresh I16 ownership replacement, 1/1 PASS; all module assessments supported.</w:t>
+      </w:r>
+    </w:p>
+    <w:p>
+      <w:r>
+        <w:t xml:space="preserve">Current integrated stack: Core 0.17 + Core 0.18 + Core 0.19 + Core 0.20 + Core 0.21 + QU 0.1 + NEI 0.4 + Discovery Protocols 0.1-0.10 + DTS 0.1 + Experimental Inquiry 0.1.</w:t>
+      </w:r>
+    </w:p>
+    <w:p>
+      <w:r>
+        <w:t xml:space="preserve">Current authority record: qualification/CURRENT_INTEGRATED_STACK_WITH_CORE_0_21_2026-09-29.md.</w:t>
+      </w:r>
+    </w:p>
+    <w:p>
+      <w:r>
+        <w:t xml:space="preserve">Current routing manifest: qualification/QUALIFIED_MODULES_2026-09-29_CORE_0_21.md.</w:t>
+      </w:r>
+    </w:p>
+    <w:p>
+      <w:pPr>
+        <w:pStyle w:val="Heading2"/>
+      </w:pPr>
+      <w:r>
+        <w:t xml:space="preserve">Authority boundaries</w:t>
+      </w:r>
+    </w:p>
+    <w:p>
+      <w:r>
+        <w:t xml:space="preserve">Core owns exact semantic admission, primitive support, Source Semantic Census conservation, Schema Closure, scope-integrity obligations, and IA closure invalidation. QU owns structured unresolved possibility. NEI owns natural/domain identity. DTS owns transition anatomy. DP owns discovery/search, sufficiency/valuation, discrepancy discipline, and Experimental Warrants. EI owns active experiment construction and observation generation under a warrant.</w:t>
+      </w:r>
+    </w:p>
+    <w:p>
+      <w:r>
+        <w:t xml:space="preserve">Schema Closure is not a new primitive, does not prove termination, and does not prove arbitrary properties over generated members. Qualified QU is not an opaque primitive leaf; known QU semantics that are load-bearing must still close to primitive support.</w:t>
+      </w:r>
+    </w:p>
+    <w:p>
+      <w:pPr>
+        <w:pStyle w:val="Heading2"/>
+      </w:pPr>
+      <w:r>
+        <w:t xml:space="preserve">Historical and cleanup status</w:t>
+      </w:r>
+    </w:p>
+    <w:p>
+      <w:r>
+        <w:t xml:space="preserve">Earlier qualification and integration attempts remain immutable evidence, including scorer/field-contract defects and provider infrastructure failures. The earlier 2026-09-29 authority manifest and integrated-stack record remain historical same-day predecessor snapshots.</w:t>
+      </w:r>
+    </w:p>
+    <w:p>
+      <w:r>
+        <w:t xml:space="preserve">This DOCX is the maintained accumulated convenience/final reference product. It does not replace exact versioned specifications, qualification records, manifests, or frozen experiment evidence.</w:t>
+      </w:r>
+    </w:p>
+    <w:p>
+      <w:r>
+        <w:br w:type="page"/>
+      </w:r>
+    </w:p>
+    <w:p>
+      <w:pPr>
+        <w:pStyle w:val="Heading1"/>
+      </w:pPr>
+      <w:r>
         <w:t xml:space="preserve">Current Qualified Authority - 2026-09-29</w:t>
       </w:r>
     </w:p>
@@ -173,11 +360,6 @@
     <w:p>
       <w:r>
         <w:t xml:space="preserve">This DOCX is the maintained accumulated convenience/final reference product. It does not replace exact versioned specifications, qualification records, manifests, or frozen experiment evidence.</w:t>
-      </w:r>
-    </w:p>
-    <w:p>
-      <w:r>
-        <w:br w:type="page"/>
       </w:r>
     </w:p>
     <w:p>

</xml_diff>

<commit_message>
Qualify Core 0.21 rendering conservation and schema closure (#63)
Validate and implement issue #62: promote Core 0.21 Rendering Conservation, Schema Closure, and Closure Invalidation; preserve frozen Source Semantic Census and scope integrity; qualify exact schema/materialization and IA invalidation behavior; integration-qualify the expanded family; ship hardened graph-derived ledger tooling; synchronize authority routing and the maintained family reference.
</commit_message>
<xml_diff>
--- a/IsoGraph_Family_Reference_Joshua_Oshiro_2026.docx
+++ b/IsoGraph_Family_Reference_Joshua_Oshiro_2026.docx
@@ -21,6 +21,193 @@
         <w:pStyle w:val="Heading1"/>
       </w:pPr>
       <w:r>
+        <w:t xml:space="preserve">Current Qualified Authority - 2026-09-29 Core 0.21</w:t>
+      </w:r>
+    </w:p>
+    <w:p>
+      <w:r>
+        <w:t xml:space="preserve">Controlling current-status summary for the accumulated IsoGraph family reference. Older current-status sections below remain historical snapshots. Exact versioned specifications and qualification records remain authority.</w:t>
+      </w:r>
+    </w:p>
+    <w:p>
+      <w:r>
+        <w:rPr>
+          <w:b/>
+        </w:rPr>
+        <w:t xml:space="preserve">Authority snapshot represented: 20fb41c3a3427f94a8da0b663ebc80ab0f2dc401</w:t>
+      </w:r>
+    </w:p>
+    <w:p>
+      <w:pPr>
+        <w:pStyle w:val="Heading2"/>
+      </w:pPr>
+      <w:r>
+        <w:t xml:space="preserve">Current effective Core</w:t>
+      </w:r>
+    </w:p>
+    <w:p>
+      <w:r>
+        <w:t xml:space="preserve">Core 0.17 qualified base + Core 0.18 observation-first clarification + Core 0.19 assertion-support/exact-rendering clarification + Core 0.20 primitive-logic-closure clarification + Core 0.21 rendering-conservation/schema-closure clarification.</w:t>
+      </w:r>
+    </w:p>
+    <w:p>
+      <w:r>
+        <w:t xml:space="preserve">Core 0.21 SHA-256: f76bc94748ab5f970fe6b21ae4734919df241912c7e5e13e07177896e5f01820.</w:t>
+      </w:r>
+    </w:p>
+    <w:p>
+      <w:pPr>
+        <w:pStyle w:val="Heading2"/>
+      </w:pPr>
+      <w:r>
+        <w:t xml:space="preserve">Core 0.21 key additions</w:t>
+      </w:r>
+    </w:p>
+    <w:p>
+      <w:r>
+        <w:t xml:space="preserve">Core 0.21 freezes a Source Semantic Census, forbids qualification by silent scope shrinkage, requires assertion-body/support/dependency closure, defines exact Schema Closure for generative semantics without exhaustive materialization, separates unresolved termination from known step semantics, and invalidates current IA fixed points when their load-bearing representation tuple changes.</w:t>
+      </w:r>
+    </w:p>
+    <w:p>
+      <w:r>
+        <w:t xml:space="preserve">Strict Core 0.21 qualification requires separate soundness, coverage, reconstruction, scope-integrity, and authority-routing gates plus a mechanically derived closure ledger. The ledger checker is qualification infrastructure, not semantic proof authority.</w:t>
+      </w:r>
+    </w:p>
+    <w:p>
+      <w:pPr>
+        <w:pStyle w:val="Heading2"/>
+      </w:pPr>
+      <w:r>
+        <w:t xml:space="preserve">Current qualified extensions and modules</w:t>
+      </w:r>
+    </w:p>
+    <w:p>
+      <w:r>
+        <w:t xml:space="preserve">QU 0.1 - SHA-256 1f1510b41e4351726e4d9e714eb32ece0d5e69f0964255aabd7b4a6e94eee4cc.</w:t>
+      </w:r>
+    </w:p>
+    <w:p>
+      <w:r>
+        <w:t xml:space="preserve">NEI 0.4 - SHA-256 6e2f0efb1f4bfbfa55bc2c5597f1ecc5b4d7bb734216543c21ba72089b0aacee.</w:t>
+      </w:r>
+    </w:p>
+    <w:p>
+      <w:r>
+        <w:t xml:space="preserve">DTS 0.1 - SHA-256 9d3478f605bc7f673e3dc73f62991a80c50b0eadebe7fbe755689e01452ae4ad.</w:t>
+      </w:r>
+    </w:p>
+    <w:p>
+      <w:r>
+        <w:t xml:space="preserve">Discovery Protocols 0.1-0.10 remain the cumulative current discovery module. DP 0.9 SHA-256: 4d6ed98288863ccd50e9cbccf2e626ff241aded3bd9fb534e0fb74ad147858ea. DP 0.10 SHA-256: 108f3998bba90aff6a386335aeb45fde663d4be0b32643a06e01fb039bff61ec.</w:t>
+      </w:r>
+    </w:p>
+    <w:p>
+      <w:r>
+        <w:t xml:space="preserve">Experimental Inquiry 0.1 - SHA-256 b94262d7384603072d0e7a2657b84f6c427e7098cea051948702c367a440c666.</w:t>
+      </w:r>
+    </w:p>
+    <w:p>
+      <w:pPr>
+        <w:pStyle w:val="Heading2"/>
+      </w:pPr>
+      <w:r>
+        <w:t xml:space="preserve">Core 0.21 qualification evidence</w:t>
+      </w:r>
+    </w:p>
+    <w:p>
+      <w:r>
+        <w:t xml:space="preserve">Experiment 057 Attempt 2: C01-C25 PASS; C26 preserved as a public field-semantics ambiguity and not retroactively rescored.</w:t>
+      </w:r>
+    </w:p>
+    <w:p>
+      <w:r>
+        <w:t xml:space="preserve">Experiment 058: fresh target-26 authority-boundary replacement, 1/1 PASS, formal QUALIFIES.</w:t>
+      </w:r>
+    </w:p>
+    <w:p>
+      <w:r>
+        <w:t xml:space="preserve">Core 0.21 qualification: qualification/CORE_0_21_QUALIFICATION.md.</w:t>
+      </w:r>
+    </w:p>
+    <w:p>
+      <w:pPr>
+        <w:pStyle w:val="Heading2"/>
+      </w:pPr>
+      <w:r>
+        <w:t xml:space="preserve">Current expanded-family integration</w:t>
+      </w:r>
+    </w:p>
+    <w:p>
+      <w:r>
+        <w:t xml:space="preserve">Experiment 059 Attempt 1: I01-I15 PASS; I16 preserved as an ownership-field ambiguity and not retroactively rescored.</w:t>
+      </w:r>
+    </w:p>
+    <w:p>
+      <w:r>
+        <w:t xml:space="preserve">Experiment 060: fresh I16 ownership replacement, 1/1 PASS; all module assessments supported.</w:t>
+      </w:r>
+    </w:p>
+    <w:p>
+      <w:r>
+        <w:t xml:space="preserve">Current integrated stack: Core 0.17 + Core 0.18 + Core 0.19 + Core 0.20 + Core 0.21 + QU 0.1 + NEI 0.4 + Discovery Protocols 0.1-0.10 + DTS 0.1 + Experimental Inquiry 0.1.</w:t>
+      </w:r>
+    </w:p>
+    <w:p>
+      <w:r>
+        <w:t xml:space="preserve">Current authority record: qualification/CURRENT_INTEGRATED_STACK_WITH_CORE_0_21_2026-09-29.md.</w:t>
+      </w:r>
+    </w:p>
+    <w:p>
+      <w:r>
+        <w:t xml:space="preserve">Current routing manifest: qualification/QUALIFIED_MODULES_2026-09-29_CORE_0_21.md.</w:t>
+      </w:r>
+    </w:p>
+    <w:p>
+      <w:pPr>
+        <w:pStyle w:val="Heading2"/>
+      </w:pPr>
+      <w:r>
+        <w:t xml:space="preserve">Authority boundaries</w:t>
+      </w:r>
+    </w:p>
+    <w:p>
+      <w:r>
+        <w:t xml:space="preserve">Core owns exact semantic admission, primitive support, Source Semantic Census conservation, Schema Closure, scope-integrity obligations, and IA closure invalidation. QU owns structured unresolved possibility. NEI owns natural/domain identity. DTS owns transition anatomy. DP owns discovery/search, sufficiency/valuation, discrepancy discipline, and Experimental Warrants. EI owns active experiment construction and observation generation under a warrant.</w:t>
+      </w:r>
+    </w:p>
+    <w:p>
+      <w:r>
+        <w:t xml:space="preserve">Schema Closure is not a new primitive, does not prove termination, and does not prove arbitrary properties over generated members. Qualified QU is not an opaque primitive leaf; known QU semantics that are load-bearing must still close to primitive support.</w:t>
+      </w:r>
+    </w:p>
+    <w:p>
+      <w:pPr>
+        <w:pStyle w:val="Heading2"/>
+      </w:pPr>
+      <w:r>
+        <w:t xml:space="preserve">Historical and cleanup status</w:t>
+      </w:r>
+    </w:p>
+    <w:p>
+      <w:r>
+        <w:t xml:space="preserve">Earlier qualification and integration attempts remain immutable evidence, including scorer/field-contract defects and provider infrastructure failures. The earlier 2026-09-29 authority manifest and integrated-stack record remain historical same-day predecessor snapshots.</w:t>
+      </w:r>
+    </w:p>
+    <w:p>
+      <w:r>
+        <w:t xml:space="preserve">This DOCX is the maintained accumulated convenience/final reference product. It does not replace exact versioned specifications, qualification records, manifests, or frozen experiment evidence.</w:t>
+      </w:r>
+    </w:p>
+    <w:p>
+      <w:r>
+        <w:br w:type="page"/>
+      </w:r>
+    </w:p>
+    <w:p>
+      <w:pPr>
+        <w:pStyle w:val="Heading1"/>
+      </w:pPr>
+      <w:r>
         <w:t xml:space="preserve">Current Qualified Authority - 2026-09-29</w:t>
       </w:r>
     </w:p>
@@ -173,11 +360,6 @@
     <w:p>
       <w:r>
         <w:t xml:space="preserve">This DOCX is the maintained accumulated convenience/final reference product. It does not replace exact versioned specifications, qualification records, manifests, or frozen experiment evidence.</w:t>
-      </w:r>
-    </w:p>
-    <w:p>
-      <w:r>
-        <w:br w:type="page"/>
       </w:r>
     </w:p>
     <w:p>

</xml_diff>